<commit_message>
added "experimental setting" as co-title to project decription
</commit_message>
<xml_diff>
--- a/Report/FinalReport.docx
+++ b/Report/FinalReport.docx
@@ -620,7 +620,23 @@
           <w:sz w:val="40"/>
           <w:szCs w:val="40"/>
         </w:rPr>
-        <w:t xml:space="preserve">Project Description: </w:t>
+        <w:t>Project Description</w:t>
+      </w:r>
+      <w:r>
+        <w:rPr>
+          <w:rFonts w:ascii="Times New Roman" w:hAnsi="Times New Roman" w:cs="Times New Roman"/>
+          <w:sz w:val="40"/>
+          <w:szCs w:val="40"/>
+        </w:rPr>
+        <w:t xml:space="preserve"> and Experimental Setting</w:t>
+      </w:r>
+      <w:r>
+        <w:rPr>
+          <w:rFonts w:ascii="Times New Roman" w:hAnsi="Times New Roman" w:cs="Times New Roman"/>
+          <w:sz w:val="40"/>
+          <w:szCs w:val="40"/>
+        </w:rPr>
+        <w:t xml:space="preserve">: </w:t>
       </w:r>
     </w:p>
     <w:p>

</xml_diff>